<commit_message>
spe updated as per latest dump from kim
</commit_message>
<xml_diff>
--- a/src/stats_cit.docx
+++ b/src/stats_cit.docx
@@ -1,7 +1,22 @@
 
 <file path=word/document.xml><?xml version="1.0" encoding="utf-8"?>
-<w:document xmlns:wpc="http://schemas.microsoft.com/office/word/2010/wordprocessingCanvas" xmlns:cx="http://schemas.microsoft.com/office/drawing/2014/chartex" xmlns:cx1="http://schemas.microsoft.com/office/drawing/2015/9/8/chartex" xmlns:cx2="http://schemas.microsoft.com/office/drawing/2015/10/21/chartex" xmlns:cx3="http://schemas.microsoft.com/office/drawing/2016/5/9/chartex" xmlns:cx4="http://schemas.microsoft.com/office/drawing/2016/5/10/chartex" xmlns:cx5="http://schemas.microsoft.com/office/drawing/2016/5/11/chartex" xmlns:cx6="http://schemas.microsoft.com/office/drawing/2016/5/12/chartex" xmlns:cx7="http://schemas.microsoft.com/office/drawing/2016/5/13/chartex" xmlns:cx8="http://schemas.microsoft.com/office/drawing/2016/5/14/chartex" xmlns:mc="http://schemas.openxmlformats.org/markup-compatibility/2006" xmlns:aink="http://schemas.microsoft.com/office/drawing/2016/ink" xmlns:am3d="http://schemas.microsoft.com/office/drawing/2017/model3d" xmlns:o="urn:schemas-microsoft-com:office:office" xmlns:oel="http://schemas.microsoft.com/office/2019/extlst" xmlns:r="http://schemas.openxmlformats.org/officeDocument/2006/relationships" xmlns:m="http://schemas.openxmlformats.org/officeDocument/2006/math" xmlns:v="urn:schemas-microsoft-com:vml" xmlns:wp14="http://schemas.microsoft.com/office/word/2010/wordprocessingDrawing" xmlns:wp="http://schemas.openxmlformats.org/drawingml/2006/wordprocessingDrawing" xmlns:w10="urn:schemas-microsoft-com:office:word" xmlns:w="http://schemas.openxmlformats.org/wordprocessingml/2006/main" xmlns:w14="http://schemas.microsoft.com/office/word/2010/wordml" xmlns:w15="http://schemas.microsoft.com/office/word/2012/wordml" xmlns:w16cex="http://schemas.microsoft.com/office/word/2018/wordml/cex" xmlns:w16cid="http://schemas.microsoft.com/office/word/2016/wordml/cid" xmlns:w16="http://schemas.microsoft.com/office/word/2018/wordml" xmlns:w16du="http://schemas.microsoft.com/office/word/2023/wordml/word16du" xmlns:w16sdtdh="http://schemas.microsoft.com/office/word/2020/wordml/sdtdatahash" xmlns:w16se="http://schemas.microsoft.com/office/word/2015/wordml/symex" xmlns:wpg="http://schemas.microsoft.com/office/word/2010/wordprocessingGroup" xmlns:wpi="http://schemas.microsoft.com/office/word/2010/wordprocessingInk" xmlns:wne="http://schemas.microsoft.com/office/word/2006/wordml" xmlns:wps="http://schemas.microsoft.com/office/word/2010/wordprocessingShape" mc:Ignorable="w14 w15 w16se w16cid w16 w16cex w16sdtdh w16du wp14">
+<w:document xmlns:wpc="http://schemas.microsoft.com/office/word/2010/wordprocessingCanvas" xmlns:cx="http://schemas.microsoft.com/office/drawing/2014/chartex" xmlns:cx1="http://schemas.microsoft.com/office/drawing/2015/9/8/chartex" xmlns:cx2="http://schemas.microsoft.com/office/drawing/2015/10/21/chartex" xmlns:cx3="http://schemas.microsoft.com/office/drawing/2016/5/9/chartex" xmlns:cx4="http://schemas.microsoft.com/office/drawing/2016/5/10/chartex" xmlns:cx5="http://schemas.microsoft.com/office/drawing/2016/5/11/chartex" xmlns:cx6="http://schemas.microsoft.com/office/drawing/2016/5/12/chartex" xmlns:cx7="http://schemas.microsoft.com/office/drawing/2016/5/13/chartex" xmlns:cx8="http://schemas.microsoft.com/office/drawing/2016/5/14/chartex" xmlns:mc="http://schemas.openxmlformats.org/markup-compatibility/2006" xmlns:aink="http://schemas.microsoft.com/office/drawing/2016/ink" xmlns:am3d="http://schemas.microsoft.com/office/drawing/2017/model3d" xmlns:o="urn:schemas-microsoft-com:office:office" xmlns:oel="http://schemas.microsoft.com/office/2019/extlst" xmlns:r="http://schemas.openxmlformats.org/officeDocument/2006/relationships" xmlns:m="http://schemas.openxmlformats.org/officeDocument/2006/math" xmlns:v="urn:schemas-microsoft-com:vml" xmlns:wp14="http://schemas.microsoft.com/office/word/2010/wordprocessingDrawing" xmlns:wp="http://schemas.openxmlformats.org/drawingml/2006/wordprocessingDrawing" xmlns:w10="urn:schemas-microsoft-com:office:word" xmlns:w="http://schemas.openxmlformats.org/wordprocessingml/2006/main" xmlns:w14="http://schemas.microsoft.com/office/word/2010/wordml" xmlns:w15="http://schemas.microsoft.com/office/word/2012/wordml" xmlns:w16cex="http://schemas.microsoft.com/office/word/2018/wordml/cex" xmlns:w16cid="http://schemas.microsoft.com/office/word/2016/wordml/cid" xmlns:w16="http://schemas.microsoft.com/office/word/2018/wordml" xmlns:w16du="http://schemas.microsoft.com/office/word/2023/wordml/word16du" xmlns:w16sdtdh="http://schemas.microsoft.com/office/word/2020/wordml/sdtdatahash" xmlns:w16sdtfl="http://schemas.microsoft.com/office/word/2024/wordml/sdtformatlock" xmlns:w16se="http://schemas.microsoft.com/office/word/2015/wordml/symex" xmlns:wpg="http://schemas.microsoft.com/office/word/2010/wordprocessingGroup" xmlns:wpi="http://schemas.microsoft.com/office/word/2010/wordprocessingInk" xmlns:wne="http://schemas.microsoft.com/office/word/2006/wordml" xmlns:wps="http://schemas.microsoft.com/office/word/2010/wordprocessingShape" mc:Ignorable="w14 w15 w16se w16cid w16 w16cex w16sdtdh w16sdtfl w16du wp14">
   <w:body>
+    <w:p>
+      <w:pPr>
+        <w:pStyle w:val="Heading1"/>
+        <w:jc w:val="center"/>
+        <w:rPr>
+          <w:rStyle w:val="Emphasis"/>
+        </w:rPr>
+      </w:pPr>
+      <w:r>
+        <w:rPr>
+          <w:rStyle w:val="Emphasis"/>
+        </w:rPr>
+        <w:t>Be sure to uncheck boxes on the Vignettes tab of the dialog box when recalling it</w:t>
+      </w:r>
+    </w:p>
     <w:p>
       <w:pPr>
         <w:pStyle w:val="Heading1"/>
@@ -460,13 +475,25 @@
         <w:t>as a plot</w:t>
       </w:r>
       <w:r>
-        <w:t xml:space="preserve">.  The dependent variables may be scale (continuous) or categorical (nominal or ordinal).  As with the TREES procedure but not most other SPSS procedures, the measurement levels declared for the variables </w:t>
+        <w:t xml:space="preserve">.  The dependent variables may be scale (continuous) or categorical (nominal or ordinal).  As with the </w:t>
+      </w:r>
+      <w:r>
+        <w:t xml:space="preserve">SPSS </w:t>
+      </w:r>
+      <w:r>
+        <w:t xml:space="preserve">TREES procedure but not most other SPSS procedures, the measurement levels declared for the variables </w:t>
       </w:r>
       <w:r>
         <w:t>are</w:t>
       </w:r>
       <w:r>
-        <w:t xml:space="preserve"> used in determining the tree structure.  Besides the categorical and continuous distinction, nominal versus ordinal matters</w:t>
+        <w:t xml:space="preserve"> used in determining the tree structure.</w:t>
+      </w:r>
+      <w:r>
+        <w:t xml:space="preserve">  If a categorical variable has many levels and can be considered ordinal, declaring it as such rather than nominal can save considerable computation time.</w:t>
+      </w:r>
+      <w:r>
+        <w:t xml:space="preserve">  Besides the categorical and continuous distinction, nominal versus ordinal matters</w:t>
       </w:r>
       <w:r>
         <w:t xml:space="preserve"> when creating splits.  </w:t>
@@ -501,10 +528,54 @@
         <w:t xml:space="preserve"> to be used as roots</w:t>
       </w:r>
       <w:r>
-        <w:t>, so it may be good to first display the full tree and then select subtrees based on the node numbers.  There are also controls for plot size and font</w:t>
-      </w:r>
-      <w:r>
-        <w:t>.  An estimated model can be saved and reloaded for display or prediction, and the estimated model remains in the workspace until replaced or the session ends or the workspace is cleared.</w:t>
+        <w:t xml:space="preserve">, so it may be </w:t>
+      </w:r>
+      <w:r>
+        <w:t>best</w:t>
+      </w:r>
+      <w:r>
+        <w:t xml:space="preserve"> to first display the full tree and then select subtrees</w:t>
+      </w:r>
+      <w:r>
+        <w:t xml:space="preserve"> to display or plot</w:t>
+      </w:r>
+      <w:r>
+        <w:t xml:space="preserve"> based on the node numbers</w:t>
+      </w:r>
+      <w:r>
+        <w:t xml:space="preserve"> that appear in the output</w:t>
+      </w:r>
+      <w:r>
+        <w:t>.  There are also controls for plot size and font</w:t>
+      </w:r>
+      <w:r>
+        <w:t xml:space="preserve"> size</w:t>
+      </w:r>
+      <w:r>
+        <w:t>.</w:t>
+      </w:r>
+      <w:r>
+        <w:t xml:space="preserve">  The terminal-node plots can be suppressed leaving just the node number in order to save space.  Various output tables with additional information can</w:t>
+      </w:r>
+      <w:r>
+        <w:t xml:space="preserve">  </w:t>
+      </w:r>
+      <w:r>
+        <w:t>be produced.</w:t>
+      </w:r>
+      <w:r>
+        <w:t xml:space="preserve"> </w:t>
+      </w:r>
+      <w:r>
+        <w:t>An estimated model can be saved and reloaded for display or prediction, and the estimated model remains in the workspace until replaced or the session ends or the workspace is cleared.</w:t>
+      </w:r>
+    </w:p>
+    <w:p>
+      <w:r>
+        <w:t>Large datasets and large numbers of categories with many categorical variables can cause the procedure to take a long time to complete, so it may be a good strategy to start with a small model and enlarge it as needed.  There is no way to terminate the procedure early except by killing the SPSS session.</w:t>
+      </w:r>
+      <w:r>
+        <w:t xml:space="preserve">  Categorical variables are limited to no more than 30 categories.  This is checked before starting the estimation.</w:t>
       </w:r>
     </w:p>
     <w:p>
@@ -636,10 +707,28 @@
     </w:p>
     <w:p>
       <w:r>
-        <w:t>User missing values by default cause cases to be excluded, but they can be included as valid, in which case, they can be the basis for splits.</w:t>
-      </w:r>
-      <w:r>
-        <w:t xml:space="preserve">  This would only make sense for categorical variables.</w:t>
+        <w:t>User missing values by default cause cases to be excluded</w:t>
+      </w:r>
+      <w:r>
+        <w:t xml:space="preserve"> if any variable used is missing</w:t>
+      </w:r>
+      <w:r>
+        <w:t>, but they can be included as valid, in which case, they can be the basis for splits.</w:t>
+      </w:r>
+      <w:r>
+        <w:t xml:space="preserve">  </w:t>
+      </w:r>
+      <w:r>
+        <w:t>Inclusion only applies to</w:t>
+      </w:r>
+      <w:r>
+        <w:t xml:space="preserve"> </w:t>
+      </w:r>
+      <w:r>
+        <w:t xml:space="preserve">categorical </w:t>
+      </w:r>
+      <w:r>
+        <w:t>variables.</w:t>
       </w:r>
     </w:p>
     <w:p>
@@ -690,7 +779,13 @@
         <w:t xml:space="preserve"> </w:t>
       </w:r>
       <w:r>
-        <w:t>box.  An ID variable must be supplied.  This will be needed if merging the predicted values back to the input dataset.</w:t>
+        <w:t>box.  An ID variable must be supplied.  Th</w:t>
+      </w:r>
+      <w:r>
+        <w:t>e ID variable</w:t>
+      </w:r>
+      <w:r>
+        <w:t xml:space="preserve"> will be needed if merging the predicted values back to the input dataset.</w:t>
       </w:r>
       <w:r>
         <w:t xml:space="preserve">  Its values must all be distinct.</w:t>
@@ -698,7 +793,25 @@
     </w:p>
     <w:p>
       <w:r>
-        <w:t xml:space="preserve">The data to be used can be the same as the estimation data and, therefore, </w:t>
+        <w:t xml:space="preserve">The </w:t>
+      </w:r>
+      <w:r>
+        <w:t>variables</w:t>
+      </w:r>
+      <w:r>
+        <w:t xml:space="preserve"> to be used </w:t>
+      </w:r>
+      <w:r>
+        <w:t>are</w:t>
+      </w:r>
+      <w:r>
+        <w:t xml:space="preserve"> the same as </w:t>
+      </w:r>
+      <w:r>
+        <w:t xml:space="preserve">for </w:t>
+      </w:r>
+      <w:r>
+        <w:t xml:space="preserve">the estimation data and, therefore, </w:t>
       </w:r>
       <w:r>
         <w:t>are</w:t>
@@ -765,7 +878,16 @@
         <w:t>er</w:t>
       </w:r>
       <w:r>
-        <w:t xml:space="preserve"> in general if the estimated model is based on variable values, not their labels.</w:t>
+        <w:t>,</w:t>
+      </w:r>
+      <w:r>
+        <w:t xml:space="preserve"> in general</w:t>
+      </w:r>
+      <w:r>
+        <w:t>,</w:t>
+      </w:r>
+      <w:r>
+        <w:t xml:space="preserve"> if the estimated model is based on variable values, not their labels.</w:t>
       </w:r>
     </w:p>
     <w:p>
@@ -785,6 +907,18 @@
       <w:r>
         <w:t>.</w:t>
       </w:r>
+      <w:r>
+        <w:t xml:space="preserve">  If neither estimation nor prediction is specified, but a model has been estimated or reloaded from a file, the </w:t>
+      </w:r>
+      <w:r>
+        <w:t>Display</w:t>
+      </w:r>
+      <w:r>
+        <w:t xml:space="preserve"> options can be applied.  The most recent model will be used.  This means, in particular, that plot parameters can be changed</w:t>
+      </w:r>
+      <w:r>
+        <w:t xml:space="preserve"> without restimating the model, assuming that it is still available.</w:t>
+      </w:r>
     </w:p>
     <w:p>
       <w:r>
@@ -797,10 +931,10 @@
         <w:t>.</w:t>
       </w:r>
       <w:r>
-        <w:t xml:space="preserve">  Only one type can be used at a time.</w:t>
-      </w:r>
-      <w:r>
-        <w:t xml:space="preserve">  The most common </w:t>
+        <w:t xml:space="preserve">  </w:t>
+      </w:r>
+      <w:r>
+        <w:t xml:space="preserve"> The most common </w:t>
       </w:r>
       <w:r>
         <w:t xml:space="preserve">is </w:t>
@@ -835,7 +969,10 @@
           <w:i/>
           <w:iCs/>
         </w:rPr>
-        <w:t>Class probabilities</w:t>
+        <w:t xml:space="preserve">Class </w:t>
+      </w:r>
+      <w:r>
+        <w:t>probabilities</w:t>
       </w:r>
       <w:r>
         <w:t xml:space="preserve"> only apply to </w:t>
@@ -853,7 +990,13 @@
         <w:t>ve a variable for each class showing the probability of that class.</w:t>
       </w:r>
       <w:r>
-        <w:t xml:space="preserve">  The variable names will be the category values adjusted to be valid as variable names.</w:t>
+        <w:t xml:space="preserve">  The variable names will be the category values</w:t>
+      </w:r>
+      <w:r>
+        <w:t xml:space="preserve"> or value labels </w:t>
+      </w:r>
+      <w:r>
+        <w:t xml:space="preserve"> adjusted to be valid as variable names.</w:t>
       </w:r>
     </w:p>
     <w:p>
@@ -865,22 +1008,13 @@
         <w:t>Quantiles</w:t>
       </w:r>
       <w:r>
-        <w:t xml:space="preserve"> can be specified for </w:t>
-      </w:r>
-      <w:r>
-        <w:t xml:space="preserve">a </w:t>
-      </w:r>
-      <w:r>
-        <w:t xml:space="preserve">single </w:t>
-      </w:r>
-      <w:r>
-        <w:t xml:space="preserve">scale </w:t>
-      </w:r>
-      <w:r>
-        <w:t xml:space="preserve">dependent </w:t>
-      </w:r>
-      <w:r>
-        <w:t xml:space="preserve">variable.  For each case, the specified quantile values for its </w:t>
+        <w:t xml:space="preserve"> can be specified </w:t>
+      </w:r>
+      <w:r>
+        <w:t>only for scale variables</w:t>
+      </w:r>
+      <w:r>
+        <w:t xml:space="preserve">.  For each case, the specified quantile values for its </w:t>
       </w:r>
       <w:r>
         <w:t>calculated subpopulation</w:t>
@@ -918,16 +1052,101 @@
       <w:r>
         <w:t>.</w:t>
       </w:r>
-    </w:p>
-    <w:p>
-      <w:r>
-        <w:t>The output dataset variable types will be based on the statistic chosen and the dependent variable type, but for merging back to the input dataset, adjustments may be required to the variable type</w:t>
+      <w:r>
+        <w:t xml:space="preserve">  The value labels for Node will be the paths defining the nodes if the lengths of all he labels are within the 120 byte limit (subject to Unicode utf-8 conversion).</w:t>
+      </w:r>
+    </w:p>
+    <w:p>
+      <w:r>
+        <w:t>The prediction method depends on the type of the dependent variable.  A node is selected based on the variables in the tree.  Then, for scale variables, the mean of th</w:t>
+      </w:r>
+      <w:r>
+        <w:t>at</w:t>
+      </w:r>
+      <w:r>
+        <w:t xml:space="preserve"> node</w:t>
+      </w:r>
+      <w:r>
+        <w:t>’</w:t>
+      </w:r>
+      <w:r>
+        <w:t>s cases is returned.  For categorical variables, the most frequent va</w:t>
+      </w:r>
+      <w:r>
+        <w:t>lue</w:t>
+      </w:r>
+      <w:r>
+        <w:t>, i.e., the mode, of the selected node is returned.  One could, alternatively, select the node based on the node probabilities</w:t>
+      </w:r>
+      <w:r>
+        <w:t>,</w:t>
+      </w:r>
+      <w:r>
+        <w:t xml:space="preserve"> if those are saved</w:t>
+      </w:r>
+      <w:r>
+        <w:t>,</w:t>
+      </w:r>
+      <w:r>
+        <w:t xml:space="preserve"> using regular SPSS code along with the mod</w:t>
+      </w:r>
+      <w:r>
+        <w:t>e</w:t>
+      </w:r>
+      <w:r>
+        <w:t xml:space="preserve"> values shown in the Terminal Nodes Statistics table.</w:t>
+      </w:r>
+    </w:p>
+    <w:p>
+      <w:r>
+        <w:t>The output dataset variable types will be based on the statistic</w:t>
+      </w:r>
+      <w:r>
+        <w:t>s</w:t>
+      </w:r>
+      <w:r>
+        <w:t xml:space="preserve"> chosen and the dependent variable type, but for merging back to the input dataset, adjustments may be required to the variable type</w:t>
       </w:r>
       <w:r>
         <w:t>, including</w:t>
       </w:r>
       <w:r>
         <w:t xml:space="preserve"> string variable widths.</w:t>
+      </w:r>
+    </w:p>
+    <w:p>
+      <w:r>
+        <w:t>The prediction</w:t>
+      </w:r>
+      <w:r>
+        <w:t xml:space="preserve"> output</w:t>
+      </w:r>
+      <w:r>
+        <w:t xml:space="preserve"> dataset has the dependent variables actual values as well as the prediction data</w:t>
+      </w:r>
+      <w:r>
+        <w:t xml:space="preserve"> to facilitate a quick review</w:t>
+      </w:r>
+      <w:r>
+        <w:t xml:space="preserve">, but if the </w:t>
+      </w:r>
+      <w:r>
+        <w:rPr>
+          <w:i/>
+          <w:iCs/>
+        </w:rPr>
+        <w:t>labels</w:t>
+      </w:r>
+      <w:r>
+        <w:t xml:space="preserve"> option was used and the dependent variables are categorical, the category labels rather than the values will appear.</w:t>
+      </w:r>
+      <w:r>
+        <w:t xml:space="preserve">  For more extensive analysis, merge the prediction dataset back into the input.</w:t>
+      </w:r>
+    </w:p>
+    <w:p>
+      <w:r>
+        <w:t>Note: in some Statistics versions when a prediction dataset is created, the Statistics user interface may freeze for a minute after the dataset is created, but then it will return to normal operation.</w:t>
       </w:r>
     </w:p>
     <w:p>
@@ -978,7 +1197,7 @@
         <w:t xml:space="preserve"> subtrees.</w:t>
       </w:r>
       <w:r>
-        <w:t>.  You can see those number</w:t>
+        <w:t xml:space="preserve">  You can see those number</w:t>
       </w:r>
       <w:r>
         <w:t>s</w:t>
@@ -1013,7 +1232,13 @@
         <w:t xml:space="preserve">in inches </w:t>
       </w:r>
       <w:r>
-        <w:t xml:space="preserve">for the main plot, i.e., tree number 1 and a different and presumably smaller size for </w:t>
+        <w:t>for the main plot, i.e., tree number 1</w:t>
+      </w:r>
+      <w:r>
+        <w:t>,</w:t>
+      </w:r>
+      <w:r>
+        <w:t xml:space="preserve"> and a different and presumably smaller size for </w:t>
       </w:r>
       <w:r>
         <w:t>the</w:t>
@@ -1030,61 +1255,189 @@
       <w:r>
         <w:t>size.</w:t>
       </w:r>
-    </w:p>
-    <w:p>
-      <w:r>
-        <w:t>If the dependent variable is categorical,  a</w:t>
-      </w:r>
-      <w:r>
-        <w:t xml:space="preserve"> confusion table can be displayed showing the distribution of predicted categories against actuals.  All labelled categories for the dependent variable will appear in the table whether or not they actually occur in the data</w:t>
-      </w:r>
-      <w:r>
-        <w:t>.</w:t>
-      </w:r>
-    </w:p>
-    <w:p>
-      <w:r>
-        <w:t xml:space="preserve">Summary statistics for the terminal nodes can be displayed </w:t>
-      </w:r>
-      <w:r>
-        <w:t>as</w:t>
-      </w:r>
-      <w:r>
-        <w:t xml:space="preserve"> a table</w:t>
-      </w:r>
-      <w:r>
-        <w:t xml:space="preserve"> by checking the </w:t>
+      <w:r>
+        <w:t xml:space="preserve">  Suppressing the terminal node plots reduces the width needed to display the plot.</w:t>
+      </w:r>
+    </w:p>
+    <w:p>
+      <w:r>
+        <w:t xml:space="preserve">The plot background color defaults to </w:t>
+      </w:r>
+      <w:r>
+        <w:t>ivory</w:t>
+      </w:r>
+      <w:r>
+        <w:t xml:space="preserve">, but the </w:t>
       </w:r>
       <w:r>
         <w:rPr>
           <w:i/>
           <w:iCs/>
         </w:rPr>
-        <w:t>Terminal node statistics table</w:t>
+        <w:t xml:space="preserve">Plot Background Color </w:t>
+      </w:r>
+      <w:r>
+        <w:t>control provides a list of alternative colors.  In syntax, you can specify any valid R color name.  To see a list of all color names, run this syntax</w:t>
+      </w:r>
+    </w:p>
+    <w:p>
+      <w:pPr>
+        <w:pStyle w:val="NoSpacing"/>
+        <w:rPr>
+          <w:rFonts w:ascii="Courier New" w:hAnsi="Courier New" w:cs="Courier New"/>
+        </w:rPr>
+      </w:pPr>
+      <w:r>
+        <w:rPr>
+          <w:rFonts w:ascii="Courier New" w:hAnsi="Courier New" w:cs="Courier New"/>
+        </w:rPr>
+        <w:t>begin program r.</w:t>
+      </w:r>
+      <w:r>
+        <w:rPr>
+          <w:rFonts w:ascii="Courier New" w:hAnsi="Courier New" w:cs="Courier New"/>
+        </w:rPr>
+        <w:br/>
+      </w:r>
+      <w:r>
+        <w:rPr>
+          <w:rFonts w:ascii="Courier New" w:hAnsi="Courier New" w:cs="Courier New"/>
+        </w:rPr>
+        <w:t>colors(distinct=TRUE)</w:t>
+      </w:r>
+      <w:r>
+        <w:rPr>
+          <w:rFonts w:ascii="Courier New" w:hAnsi="Courier New" w:cs="Courier New"/>
+        </w:rPr>
+        <w:br/>
+        <w:t>end program.</w:t>
+      </w:r>
+    </w:p>
+    <w:p>
+      <w:pPr>
+        <w:pStyle w:val="NoSpacing"/>
+        <w:rPr>
+          <w:rFonts w:ascii="Courier New" w:hAnsi="Courier New" w:cs="Courier New"/>
+        </w:rPr>
+      </w:pPr>
+    </w:p>
+    <w:p>
+      <w:r>
+        <w:t>By default, plots are not displayed on the inner nodes.  If they are selected, the plot size will likely need to be increased.  The inner plots are boxplots for scale dependent variables and bar plots for categorical variables.</w:t>
+      </w:r>
+      <w:r>
+        <w:t xml:space="preserve">  They are not available for mob models.</w:t>
+      </w:r>
+      <w:r>
+        <w:t xml:space="preserve">  The plot backgrounds can match the general plot background</w:t>
+      </w:r>
+      <w:r>
+        <w:t xml:space="preserve"> with a little brightening if possible</w:t>
+      </w:r>
+      <w:r>
+        <w:t xml:space="preserve"> or be white.</w:t>
+      </w:r>
+    </w:p>
+    <w:p>
+      <w:r>
+        <w:t>The plots displayed in the Viewer are in png format</w:t>
+      </w:r>
+      <w:r>
+        <w:t>, which is not editable</w:t>
+      </w:r>
+      <w:r>
+        <w:t>.  You can specify external files for the plots in png</w:t>
+      </w:r>
+      <w:r>
+        <w:t>, svg, or pdf</w:t>
+      </w:r>
+      <w:r>
+        <w:t xml:space="preserve"> format using the </w:t>
       </w:r>
       <w:r>
         <w:rPr>
           <w:i/>
           <w:iCs/>
         </w:rPr>
-        <w:t xml:space="preserve"> </w:t>
-      </w:r>
-      <w:r>
-        <w:t>box</w:t>
-      </w:r>
-      <w:r>
-        <w:t>.  For scale-level dependent variables, the mean is shown; for categorical variables, the mode is shown.  There can be ties in the mode statistic, but only one value per node is shown in the table.</w:t>
-      </w:r>
-    </w:p>
-    <w:p>
-      <w:r>
-        <w:t xml:space="preserve">A </w:t>
+        <w:t xml:space="preserve">Location and Rootname </w:t>
+      </w:r>
+      <w:r>
+        <w:t xml:space="preserve">and </w:t>
       </w:r>
       <w:r>
         <w:rPr>
           <w:i/>
           <w:iCs/>
         </w:rPr>
+        <w:t>Plot File Format</w:t>
+      </w:r>
+      <w:r>
+        <w:t xml:space="preserve"> controls.  The </w:t>
+      </w:r>
+      <w:r>
+        <w:t xml:space="preserve">node numbers will be added to the </w:t>
+      </w:r>
+      <w:r>
+        <w:t>file names for the plot and have the extension appropriate for the chosen format.  SVG format may be the best choice if the software used for display supports that format, because it is resizable and editable.</w:t>
+      </w:r>
+    </w:p>
+    <w:p>
+      <w:r>
+        <w:t>If the dependent variable is categorical,  a</w:t>
+      </w:r>
+      <w:r>
+        <w:t xml:space="preserve"> confusion table can be displayed showing the distribution of predicted categories against actuals.  All labelled categories for the dependent variable will appear in the table whether or not they actually occur in the data</w:t>
+      </w:r>
+      <w:r>
+        <w:t>.</w:t>
+      </w:r>
+    </w:p>
+    <w:p>
+      <w:r>
+        <w:t xml:space="preserve">Summary statistics for the terminal nodes can be displayed </w:t>
+      </w:r>
+      <w:r>
+        <w:t>as</w:t>
+      </w:r>
+      <w:r>
+        <w:t xml:space="preserve"> a table</w:t>
+      </w:r>
+      <w:r>
+        <w:t xml:space="preserve"> by checking the </w:t>
+      </w:r>
+      <w:r>
+        <w:rPr>
+          <w:i/>
+          <w:iCs/>
+        </w:rPr>
+        <w:t>Terminal node statistics table</w:t>
+      </w:r>
+      <w:r>
+        <w:rPr>
+          <w:i/>
+          <w:iCs/>
+        </w:rPr>
+        <w:t xml:space="preserve"> </w:t>
+      </w:r>
+      <w:r>
+        <w:t>box</w:t>
+      </w:r>
+      <w:r>
+        <w:t>.  For scale-level dependent variables, the mean is shown; for categorical variables, the mode is shown.  There can be ties in the mode statistic, but only one value per node is shown in the table.</w:t>
+      </w:r>
+      <w:r>
+        <w:t xml:space="preserve">  Optionally, the paths to the terminal nodes can be included in this table.  .  It shows the paths in SPSS syntax style, but due to differences in how SPSS and R handle single and double quotes, it might not always be runable without editing.</w:t>
+      </w:r>
+    </w:p>
+    <w:p>
+      <w:r>
+        <w:t xml:space="preserve">A </w:t>
+      </w:r>
+      <w:r>
+        <w:rPr>
+          <w:i/>
+          <w:iCs/>
+        </w:rPr>
         <w:t>Structural Change Tests</w:t>
       </w:r>
       <w:r>
@@ -1104,6 +1457,18 @@
       </w:r>
       <w:r>
         <w:t xml:space="preserve">  The values are labelled by node number and variable name.</w:t>
+      </w:r>
+    </w:p>
+    <w:p>
+      <w:r>
+        <w:rPr>
+          <w:i/>
+          <w:iCs/>
+        </w:rPr>
+        <w:t>Terminal node</w:t>
+      </w:r>
+      <w:r>
+        <w:t xml:space="preserve"> plots can be included or not.</w:t>
       </w:r>
     </w:p>
     <w:p>
@@ -1325,6 +1690,66 @@
       </w:r>
     </w:p>
     <w:p>
+      <w:r>
+        <w:rPr>
+          <w:b/>
+          <w:bCs/>
+        </w:rPr>
+        <w:t>Multiway Nominal Variable Splits (multiway):</w:t>
+      </w:r>
+      <w:r>
+        <w:t xml:space="preserve"> </w:t>
+      </w:r>
+      <w:r>
+        <w:t xml:space="preserve"> </w:t>
+      </w:r>
+      <w:r>
+        <w:t xml:space="preserve">If </w:t>
+      </w:r>
+      <w:r>
+        <w:t>“Yes”</w:t>
+      </w:r>
+      <w:r>
+        <w:t xml:space="preserve">, </w:t>
+      </w:r>
+      <w:r>
+        <w:t xml:space="preserve">multiway splits </w:t>
+      </w:r>
+      <w:r>
+        <w:t xml:space="preserve">are enabled </w:t>
+      </w:r>
+      <w:r>
+        <w:t xml:space="preserve">for all levels </w:t>
+      </w:r>
+      <w:r>
+        <w:t xml:space="preserve">of </w:t>
+      </w:r>
+      <w:r>
+        <w:t>nominal variables</w:t>
+      </w:r>
+      <w:r>
+        <w:t>.</w:t>
+      </w:r>
+      <w:r>
+        <w:t xml:space="preserve">  While this is equivalent to multiple two-way splits, it may produce a more natural tree.</w:t>
+      </w:r>
+    </w:p>
+    <w:p>
+      <w:r>
+        <w:rPr>
+          <w:b/>
+          <w:bCs/>
+        </w:rPr>
+        <w:t>CPU Cores to Use (cores):</w:t>
+      </w:r>
+      <w:r>
+        <w:t xml:space="preserve"> number of CPU cores to use.  Most modern computers provide multiple CPU cores.  The default value is 1, but for large problems, increasing this value may speed up the procedure  considerably.</w:t>
+      </w:r>
+      <w:r>
+        <w:t xml:space="preserve">  However, the availability and benefit may var with the operating system in use.</w:t>
+      </w:r>
+    </w:p>
+    <w:p>
       <w:pPr>
         <w:pStyle w:val="Heading2"/>
       </w:pPr>
@@ -1348,46 +1773,41 @@
           <w:b/>
           <w:bCs/>
         </w:rPr>
-        <w:t xml:space="preserve"> Whether to Use Bonferroni Correction: </w:t>
-      </w:r>
-      <w:r>
-        <w:t xml:space="preserve">alpha and whether to use </w:t>
-      </w:r>
-      <w:r>
-        <w:t xml:space="preserve">the </w:t>
-      </w:r>
-      <w:r>
-        <w:t xml:space="preserve">Bonferroni </w:t>
-      </w:r>
-      <w:r>
-        <w:t>m</w:t>
-      </w:r>
-      <w:r>
-        <w:t xml:space="preserve">ultiple </w:t>
-      </w:r>
-      <w:r>
-        <w:t>t</w:t>
-      </w:r>
-      <w:r>
-        <w:t xml:space="preserve">esting </w:t>
-      </w:r>
-      <w:r>
-        <w:t>c</w:t>
-      </w:r>
-      <w:r>
-        <w:t>orrection</w:t>
-      </w:r>
-    </w:p>
-    <w:p>
+        <w:t xml:space="preserve"> Whether to Use Bonferroni Correction </w:t>
+      </w:r>
       <w:r>
         <w:rPr>
           <w:b/>
           <w:bCs/>
         </w:rPr>
-        <w:t>Minimum Node Size for Split: </w:t>
-      </w:r>
-      <w:r>
-        <w:t>Minimum number of observations in a node</w:t>
+        <w:t xml:space="preserve">(alpha and BONFERRONI): </w:t>
+      </w:r>
+      <w:r>
+        <w:t xml:space="preserve">alpha and whether to use </w:t>
+      </w:r>
+      <w:r>
+        <w:t xml:space="preserve">the </w:t>
+      </w:r>
+      <w:r>
+        <w:t xml:space="preserve">Bonferroni </w:t>
+      </w:r>
+      <w:r>
+        <w:t>m</w:t>
+      </w:r>
+      <w:r>
+        <w:t xml:space="preserve">ultiple </w:t>
+      </w:r>
+      <w:r>
+        <w:t>t</w:t>
+      </w:r>
+      <w:r>
+        <w:t xml:space="preserve">esting </w:t>
+      </w:r>
+      <w:r>
+        <w:t>c</w:t>
+      </w:r>
+      <w:r>
+        <w:t>orrection</w:t>
       </w:r>
     </w:p>
     <w:p>
@@ -1396,10 +1816,10 @@
           <w:b/>
           <w:bCs/>
         </w:rPr>
-        <w:t>Maximum Tree Depth: </w:t>
-      </w:r>
-      <w:r>
-        <w:t>Maximum depth of a tree</w:t>
+        <w:t>Minimum Node Size for Split: </w:t>
+      </w:r>
+      <w:r>
+        <w:t>Minimum number of observations in a node</w:t>
       </w:r>
     </w:p>
     <w:p>
@@ -1408,17 +1828,17 @@
           <w:b/>
           <w:bCs/>
         </w:rPr>
-        <w:t>Trimming:  </w:t>
-      </w:r>
-      <w:r>
-        <w:t>the trimming in the parameter instability test for the numerical variables. If smaller than 1, it is interpreted as the fraction relative to the current node size</w:t>
+        <w:t>Maximum Tree Depth</w:t>
       </w:r>
       <w:r>
         <w:rPr>
           <w:b/>
           <w:bCs/>
         </w:rPr>
-        <w:t>.</w:t>
+        <w:t xml:space="preserve"> (maxdepth): </w:t>
+      </w:r>
+      <w:r>
+        <w:t>Maximum depth of a tree</w:t>
       </w:r>
     </w:p>
     <w:p>
@@ -1427,25 +1847,107 @@
           <w:b/>
           <w:bCs/>
         </w:rPr>
-        <w:t>Post Pruning: post-pruning rule. </w:t>
-      </w:r>
-      <w:r>
-        <w:t>For likelihood-based mob trees, prune can be "AIC" or "BIC" for post-pruning based on the corresponding information criteria.</w:t>
-      </w:r>
-      <w:r>
-        <w:t xml:space="preserve"> </w:t>
-      </w:r>
-      <w:r>
-        <w:t> By default, there is no post pruning.</w:t>
-      </w:r>
-    </w:p>
-    <w:p>
+        <w:t>Trimming</w:t>
+      </w:r>
       <w:r>
         <w:rPr>
           <w:b/>
           <w:bCs/>
         </w:rPr>
+        <w:t xml:space="preserve"> (trim)</w:t>
+      </w:r>
+      <w:r>
+        <w:rPr>
+          <w:b/>
+          <w:bCs/>
+        </w:rPr>
+        <w:t>:  </w:t>
+      </w:r>
+      <w:r>
+        <w:t>the trimming in the parameter instability test for the numerical variables. If smaller than 1, it is interpreted as the fraction relative to the current node size</w:t>
+      </w:r>
+      <w:r>
+        <w:rPr>
+          <w:b/>
+          <w:bCs/>
+        </w:rPr>
+        <w:t>.</w:t>
+      </w:r>
+    </w:p>
+    <w:p>
+      <w:r>
+        <w:rPr>
+          <w:b/>
+          <w:bCs/>
+        </w:rPr>
+        <w:t>Post Pruning: post-pruning rule</w:t>
+      </w:r>
+      <w:r>
+        <w:rPr>
+          <w:b/>
+          <w:bCs/>
+        </w:rPr>
+        <w:t xml:space="preserve"> (</w:t>
+      </w:r>
+      <w:r>
+        <w:rPr>
+          <w:b/>
+          <w:bCs/>
+        </w:rPr>
+        <w:t>prune</w:t>
+      </w:r>
+      <w:r>
+        <w:rPr>
+          <w:b/>
+          <w:bCs/>
+        </w:rPr>
+        <w:t>)</w:t>
+      </w:r>
+      <w:r>
+        <w:rPr>
+          <w:b/>
+          <w:bCs/>
+        </w:rPr>
+        <w:t>:</w:t>
+      </w:r>
+      <w:r>
+        <w:rPr>
+          <w:b/>
+          <w:bCs/>
+        </w:rPr>
+        <w:t xml:space="preserve"> </w:t>
+      </w:r>
+      <w:r>
+        <w:rPr>
+          <w:b/>
+          <w:bCs/>
+        </w:rPr>
+        <w:t> </w:t>
+      </w:r>
+      <w:r>
+        <w:t>For likelihood-based mob trees, prune can be "AIC" or "BIC" for post-pruning based on the corresponding information criteria.</w:t>
+      </w:r>
+      <w:r>
+        <w:t xml:space="preserve"> </w:t>
+      </w:r>
+      <w:r>
+        <w:t> By default, there is no post pruning.</w:t>
+      </w:r>
+    </w:p>
+    <w:p>
+      <w:r>
+        <w:rPr>
+          <w:b/>
+          <w:bCs/>
+        </w:rPr>
         <w:t>Parameter Instability Test</w:t>
+      </w:r>
+      <w:r>
+        <w:rPr>
+          <w:b/>
+          <w:bCs/>
+        </w:rPr>
+        <w:t xml:space="preserve"> (ordinal)</w:t>
       </w:r>
       <w:r>
         <w:t>: the type of parameter instability test that should be employed for ordinal partitioning variables. If </w:t>
@@ -1479,6 +1981,42 @@
       </w:r>
       <w:r>
         <w:t> a weighted double maximum test is used.</w:t>
+      </w:r>
+    </w:p>
+    <w:p>
+      <w:r>
+        <w:rPr>
+          <w:b/>
+          <w:bCs/>
+        </w:rPr>
+        <w:t>Multiway Nominal Variable Splits (multiway)</w:t>
+      </w:r>
+      <w:r>
+        <w:t xml:space="preserve">: </w:t>
+      </w:r>
+      <w:r>
+        <w:t> By default</w:t>
+      </w:r>
+      <w:r>
+        <w:t>,</w:t>
+      </w:r>
+      <w:r>
+        <w:t xml:space="preserve"> the best binary split is searched (by minimizing the objective function). Alternatively, if set to </w:t>
+      </w:r>
+      <w:r>
+        <w:t>“Yes</w:t>
+      </w:r>
+      <w:r>
+        <w:t xml:space="preserve">", the node is split into all levels of the </w:t>
+      </w:r>
+      <w:r>
+        <w:t>nominal</w:t>
+      </w:r>
+      <w:r>
+        <w:t xml:space="preserve"> variable.</w:t>
+      </w:r>
+      <w:r>
+        <w:t xml:space="preserve">  While this is equivalent to multiple two-way splits, it may produce a more natural tree.</w:t>
       </w:r>
     </w:p>
     <w:p>
@@ -1491,7 +2029,13 @@
     </w:p>
     <w:p>
       <w:r>
-        <w:t xml:space="preserve">Using this tab, you can display the selected documents in a browser tab.  If you select more than one document, you might see only the last one depending on the browser </w:t>
+        <w:t>Using this tab, you can display the selected documents in a browser tab.</w:t>
+      </w:r>
+      <w:r>
+        <w:t xml:space="preserve">  The dialog and syntax help is available there along with several articles by the authors of the procedures used by this extension command.</w:t>
+      </w:r>
+      <w:r>
+        <w:t xml:space="preserve">  If you select more than one document, you might see only the last one depending on the browser </w:t>
       </w:r>
       <w:r>
         <w:t xml:space="preserve">used </w:t>
@@ -1790,7 +2334,7 @@
         <w:rPr>
           <w:rFonts w:ascii="Aptos" w:hAnsi="Aptos"/>
         </w:rPr>
-        <w:t>.</w:t>
+        <w:t xml:space="preserve"> except that it was run with the multiway switch set to Yes, so the class splits have four children instead of the two children shown in the tree in Figure 1.</w:t>
       </w:r>
     </w:p>
     <w:p>
@@ -1799,10 +2343,10 @@
           <w:noProof/>
         </w:rPr>
         <w:drawing>
-          <wp:inline distT="0" distB="0" distL="0" distR="0" wp14:anchorId="1A2080AD" wp14:editId="10C25BA7">
-            <wp:extent cx="5943600" cy="5943600"/>
-            <wp:effectExtent l="114300" t="133350" r="114300" b="133350"/>
-            <wp:docPr id="896089542" name="Picture 3" descr="A diagram of a graph&#10;&#10;Description automatically generated"/>
+          <wp:inline distT="0" distB="0" distL="0" distR="0" wp14:anchorId="7C065019" wp14:editId="4D77B495">
+            <wp:extent cx="6887536" cy="5430008"/>
+            <wp:effectExtent l="133350" t="133350" r="142240" b="132715"/>
+            <wp:docPr id="2045692724" name="Picture 1" descr="A diagram of a family tree&#10;&#10;Description automatically generated"/>
             <wp:cNvGraphicFramePr>
               <a:graphicFrameLocks xmlns:a="http://schemas.openxmlformats.org/drawingml/2006/main" noChangeAspect="1"/>
             </wp:cNvGraphicFramePr>
@@ -1810,36 +2354,23 @@
               <a:graphicData uri="http://schemas.openxmlformats.org/drawingml/2006/picture">
                 <pic:pic xmlns:pic="http://schemas.openxmlformats.org/drawingml/2006/picture">
                   <pic:nvPicPr>
-                    <pic:cNvPr id="896089542" name="Picture 3" descr="A diagram of a graph&#10;&#10;Description automatically generated"/>
-                    <pic:cNvPicPr>
-                      <a:picLocks noChangeAspect="1" noChangeArrowheads="1"/>
-                    </pic:cNvPicPr>
+                    <pic:cNvPr id="2045692724" name="Picture 1" descr="A diagram of a family tree&#10;&#10;Description automatically generated"/>
+                    <pic:cNvPicPr/>
                   </pic:nvPicPr>
                   <pic:blipFill>
-                    <a:blip r:embed="rId6">
-                      <a:extLst>
-                        <a:ext uri="{28A0092B-C50C-407E-A947-70E740481C1C}">
-                          <a14:useLocalDpi xmlns:a14="http://schemas.microsoft.com/office/drawing/2010/main" val="0"/>
-                        </a:ext>
-                      </a:extLst>
-                    </a:blip>
-                    <a:srcRect/>
+                    <a:blip r:embed="rId6"/>
                     <a:stretch>
                       <a:fillRect/>
                     </a:stretch>
                   </pic:blipFill>
-                  <pic:spPr bwMode="auto">
+                  <pic:spPr>
                     <a:xfrm>
                       <a:off x="0" y="0"/>
-                      <a:ext cx="5943600" cy="5943600"/>
+                      <a:ext cx="6887536" cy="5430008"/>
                     </a:xfrm>
                     <a:prstGeom prst="rect">
                       <a:avLst/>
                     </a:prstGeom>
-                    <a:noFill/>
-                    <a:ln>
-                      <a:noFill/>
-                    </a:ln>
                     <a:effectLst>
                       <a:outerShdw blurRad="63500" sx="102000" sy="102000" algn="ctr" rotWithShape="0">
                         <a:prstClr val="black">
@@ -2591,7 +3122,7 @@
 </file>
 
 <file path=word/numbering.xml><?xml version="1.0" encoding="utf-8"?>
-<w:numbering xmlns:wpc="http://schemas.microsoft.com/office/word/2010/wordprocessingCanvas" xmlns:cx="http://schemas.microsoft.com/office/drawing/2014/chartex" xmlns:cx1="http://schemas.microsoft.com/office/drawing/2015/9/8/chartex" xmlns:cx2="http://schemas.microsoft.com/office/drawing/2015/10/21/chartex" xmlns:cx3="http://schemas.microsoft.com/office/drawing/2016/5/9/chartex" xmlns:cx4="http://schemas.microsoft.com/office/drawing/2016/5/10/chartex" xmlns:cx5="http://schemas.microsoft.com/office/drawing/2016/5/11/chartex" xmlns:cx6="http://schemas.microsoft.com/office/drawing/2016/5/12/chartex" xmlns:cx7="http://schemas.microsoft.com/office/drawing/2016/5/13/chartex" xmlns:cx8="http://schemas.microsoft.com/office/drawing/2016/5/14/chartex" xmlns:mc="http://schemas.openxmlformats.org/markup-compatibility/2006" xmlns:aink="http://schemas.microsoft.com/office/drawing/2016/ink" xmlns:am3d="http://schemas.microsoft.com/office/drawing/2017/model3d" xmlns:o="urn:schemas-microsoft-com:office:office" xmlns:oel="http://schemas.microsoft.com/office/2019/extlst" xmlns:r="http://schemas.openxmlformats.org/officeDocument/2006/relationships" xmlns:m="http://schemas.openxmlformats.org/officeDocument/2006/math" xmlns:v="urn:schemas-microsoft-com:vml" xmlns:wp14="http://schemas.microsoft.com/office/word/2010/wordprocessingDrawing" xmlns:wp="http://schemas.openxmlformats.org/drawingml/2006/wordprocessingDrawing" xmlns:w10="urn:schemas-microsoft-com:office:word" xmlns:w="http://schemas.openxmlformats.org/wordprocessingml/2006/main" xmlns:w14="http://schemas.microsoft.com/office/word/2010/wordml" xmlns:w15="http://schemas.microsoft.com/office/word/2012/wordml" xmlns:w16cex="http://schemas.microsoft.com/office/word/2018/wordml/cex" xmlns:w16cid="http://schemas.microsoft.com/office/word/2016/wordml/cid" xmlns:w16="http://schemas.microsoft.com/office/word/2018/wordml" xmlns:w16du="http://schemas.microsoft.com/office/word/2023/wordml/word16du" xmlns:w16sdtdh="http://schemas.microsoft.com/office/word/2020/wordml/sdtdatahash" xmlns:w16se="http://schemas.microsoft.com/office/word/2015/wordml/symex" xmlns:wpg="http://schemas.microsoft.com/office/word/2010/wordprocessingGroup" xmlns:wpi="http://schemas.microsoft.com/office/word/2010/wordprocessingInk" xmlns:wne="http://schemas.microsoft.com/office/word/2006/wordml" xmlns:wps="http://schemas.microsoft.com/office/word/2010/wordprocessingShape" mc:Ignorable="w14 w15 w16se w16cid w16 w16cex w16sdtdh w16du wp14">
+<w:numbering xmlns:wpc="http://schemas.microsoft.com/office/word/2010/wordprocessingCanvas" xmlns:cx="http://schemas.microsoft.com/office/drawing/2014/chartex" xmlns:cx1="http://schemas.microsoft.com/office/drawing/2015/9/8/chartex" xmlns:cx2="http://schemas.microsoft.com/office/drawing/2015/10/21/chartex" xmlns:cx3="http://schemas.microsoft.com/office/drawing/2016/5/9/chartex" xmlns:cx4="http://schemas.microsoft.com/office/drawing/2016/5/10/chartex" xmlns:cx5="http://schemas.microsoft.com/office/drawing/2016/5/11/chartex" xmlns:cx6="http://schemas.microsoft.com/office/drawing/2016/5/12/chartex" xmlns:cx7="http://schemas.microsoft.com/office/drawing/2016/5/13/chartex" xmlns:cx8="http://schemas.microsoft.com/office/drawing/2016/5/14/chartex" xmlns:mc="http://schemas.openxmlformats.org/markup-compatibility/2006" xmlns:aink="http://schemas.microsoft.com/office/drawing/2016/ink" xmlns:am3d="http://schemas.microsoft.com/office/drawing/2017/model3d" xmlns:o="urn:schemas-microsoft-com:office:office" xmlns:oel="http://schemas.microsoft.com/office/2019/extlst" xmlns:r="http://schemas.openxmlformats.org/officeDocument/2006/relationships" xmlns:m="http://schemas.openxmlformats.org/officeDocument/2006/math" xmlns:v="urn:schemas-microsoft-com:vml" xmlns:wp14="http://schemas.microsoft.com/office/word/2010/wordprocessingDrawing" xmlns:wp="http://schemas.openxmlformats.org/drawingml/2006/wordprocessingDrawing" xmlns:w10="urn:schemas-microsoft-com:office:word" xmlns:w="http://schemas.openxmlformats.org/wordprocessingml/2006/main" xmlns:w14="http://schemas.microsoft.com/office/word/2010/wordml" xmlns:w15="http://schemas.microsoft.com/office/word/2012/wordml" xmlns:w16cex="http://schemas.microsoft.com/office/word/2018/wordml/cex" xmlns:w16cid="http://schemas.microsoft.com/office/word/2016/wordml/cid" xmlns:w16="http://schemas.microsoft.com/office/word/2018/wordml" xmlns:w16du="http://schemas.microsoft.com/office/word/2023/wordml/word16du" xmlns:w16sdtdh="http://schemas.microsoft.com/office/word/2020/wordml/sdtdatahash" xmlns:w16sdtfl="http://schemas.microsoft.com/office/word/2024/wordml/sdtformatlock" xmlns:w16se="http://schemas.microsoft.com/office/word/2015/wordml/symex" xmlns:wpg="http://schemas.microsoft.com/office/word/2010/wordprocessingGroup" xmlns:wpi="http://schemas.microsoft.com/office/word/2010/wordprocessingInk" xmlns:wne="http://schemas.microsoft.com/office/word/2006/wordml" xmlns:wps="http://schemas.microsoft.com/office/word/2010/wordprocessingShape" mc:Ignorable="w14 w15 w16se w16cid w16 w16cex w16sdtdh w16sdtfl w16du wp14">
   <w:abstractNum w:abstractNumId="0" w15:restartNumberingAfterBreak="0">
     <w:nsid w:val="7A9D31FD"/>
     <w:multiLevelType w:val="multilevel"/>
@@ -2712,7 +3243,7 @@
 </file>
 
 <file path=word/styles.xml><?xml version="1.0" encoding="utf-8"?>
-<w:styles xmlns:mc="http://schemas.openxmlformats.org/markup-compatibility/2006" xmlns:r="http://schemas.openxmlformats.org/officeDocument/2006/relationships" xmlns:w="http://schemas.openxmlformats.org/wordprocessingml/2006/main" xmlns:w14="http://schemas.microsoft.com/office/word/2010/wordml" xmlns:w15="http://schemas.microsoft.com/office/word/2012/wordml" xmlns:w16cex="http://schemas.microsoft.com/office/word/2018/wordml/cex" xmlns:w16cid="http://schemas.microsoft.com/office/word/2016/wordml/cid" xmlns:w16="http://schemas.microsoft.com/office/word/2018/wordml" xmlns:w16du="http://schemas.microsoft.com/office/word/2023/wordml/word16du" xmlns:w16sdtdh="http://schemas.microsoft.com/office/word/2020/wordml/sdtdatahash" xmlns:w16se="http://schemas.microsoft.com/office/word/2015/wordml/symex" mc:Ignorable="w14 w15 w16se w16cid w16 w16cex w16sdtdh w16du">
+<w:styles xmlns:mc="http://schemas.openxmlformats.org/markup-compatibility/2006" xmlns:r="http://schemas.openxmlformats.org/officeDocument/2006/relationships" xmlns:w="http://schemas.openxmlformats.org/wordprocessingml/2006/main" xmlns:w14="http://schemas.microsoft.com/office/word/2010/wordml" xmlns:w15="http://schemas.microsoft.com/office/word/2012/wordml" xmlns:w16cex="http://schemas.microsoft.com/office/word/2018/wordml/cex" xmlns:w16cid="http://schemas.microsoft.com/office/word/2016/wordml/cid" xmlns:w16="http://schemas.microsoft.com/office/word/2018/wordml" xmlns:w16du="http://schemas.microsoft.com/office/word/2023/wordml/word16du" xmlns:w16sdtdh="http://schemas.microsoft.com/office/word/2020/wordml/sdtdatahash" xmlns:w16sdtfl="http://schemas.microsoft.com/office/word/2024/wordml/sdtformatlock" xmlns:w16se="http://schemas.microsoft.com/office/word/2015/wordml/symex" mc:Ignorable="w14 w15 w16se w16cid w16 w16cex w16sdtdh w16sdtfl w16du">
   <w:docDefaults>
     <w:rPrDefault>
       <w:rPr>
@@ -3111,7 +3642,7 @@
   <w:style w:type="paragraph" w:default="1" w:styleId="Normal">
     <w:name w:val="Normal"/>
     <w:qFormat/>
-    <w:rsid w:val="002853AE"/>
+    <w:rsid w:val="00BA376B"/>
   </w:style>
   <w:style w:type="paragraph" w:styleId="Heading1">
     <w:name w:val="heading 1"/>
@@ -3676,6 +4207,26 @@
       <w:szCs w:val="18"/>
     </w:rPr>
   </w:style>
+  <w:style w:type="character" w:styleId="Emphasis">
+    <w:name w:val="Emphasis"/>
+    <w:basedOn w:val="DefaultParagraphFont"/>
+    <w:uiPriority w:val="20"/>
+    <w:qFormat/>
+    <w:rsid w:val="00765DAF"/>
+    <w:rPr>
+      <w:i/>
+      <w:iCs/>
+    </w:rPr>
+  </w:style>
+  <w:style w:type="paragraph" w:styleId="NoSpacing">
+    <w:name w:val="No Spacing"/>
+    <w:uiPriority w:val="1"/>
+    <w:qFormat/>
+    <w:rsid w:val="002F587E"/>
+    <w:pPr>
+      <w:spacing w:after="0" w:line="240" w:lineRule="auto"/>
+    </w:pPr>
+  </w:style>
 </w:styles>
 </file>
 

</xml_diff>